<commit_message>
Add complete BOM (real part numbers + Farnell P/Ns); update status notes
</commit_message>
<xml_diff>
--- a/docs/SFS_Node_Hardware_Documentation_v0.1.docx
+++ b/docs/SFS_Node_Hardware_Documentation_v0.1.docx
@@ -1189,7 +1189,7 @@
       </w:pPr>
       <w:r>
         <w:rPr/>
-        <w:t>A starter Bill of Materials (CSV) is provided in the project repository (electronics/bom/). Manufacturer part numbers, quantities and supplier references will be completed alongside the schematic source files.</w:t>
+        <w:t>The full Bill of Materials (CSV) is provided in the project repository (electronics/bom/BOM_SFS_Node_v0.1.csv), with manufacturer part numbers, packages, quantities and supplier references (Farnell part numbers).</w:t>
       </w:r>
     </w:p>
     <w:p>
@@ -1441,7 +1441,7 @@
       </w:pPr>
       <w:r>
         <w:rPr/>
-        <w:t>Files provided in the v0.1 repository: schematic PDF, Gerber fabrication files, and a starter BOM (CSV). Enclosure STL files and the editable schematic/PCB source files (Altium project) are pending and will be added in a later update (source files after June 2026). PCB is reproducible via any standard 2-layer FR4 fabrication service; the enclosure is printable on any FDM printer. Validated through field deployment at Novak farm, Kranj, Slovenia (4 sensor nodes, 1 concentrator) under OpenAgri SIP13.</w:t>
+        <w:t>Files provided in the v0.1 repository: schematic PDF, Gerber fabrication files, and the full BOM (CSV). Enclosure STL files and the editable schematic/PCB source files (Altium project) are pending and will be added in a later update (source files after June 2026). PCB is reproducible via any standard 2-layer FR4 fabrication service; the enclosure is printable on any FDM printer. Validated through field deployment at Novak farm, Kranj, Slovenia (4 sensor nodes, 1 concentrator) under OpenAgri SIP13.</w:t>
       </w:r>
     </w:p>
     <w:p>

</xml_diff>

<commit_message>
Add Altium design sources, node enclosure STL and sensor-mount documentation
- electronics/altium/: editable schematic and PCB sources (PrjPCB, SchDoc, PcbDoc)
- mechanical/: node enclosure STL (FDM-printable) and standard-pipe sensor-mount description
- docs: hardware documentation update

Co-Authored-By: Claude Fable 5 <noreply@anthropic.com>
</commit_message>
<xml_diff>
--- a/docs/SFS_Node_Hardware_Documentation_v0.1.docx
+++ b/docs/SFS_Node_Hardware_Documentation_v0.1.docx
@@ -44,7 +44,7 @@
         <w:br/>
         <w:t>Contact Email: info@inokron.com</w:t>
         <w:br/>
-        <w:t>Repository URL: https://github.com/Inokron/OA-HWcomponents</w:t>
+        <w:t>Repository URL: https://github.com/inokron-doo/OA-HWcomponents</w:t>
         <w:br/>
         <w:t>Version: v0.1</w:t>
         <w:br/>
@@ -1419,7 +1419,7 @@
       </w:pPr>
       <w:r>
         <w:rPr/>
-        <w:t>Files provided in the v0.1 repository: schematic PDF, Gerber fabrication files, and the full BOM (CSV). Enclosure STL files and the editable schematic/PCB source files (Altium project) are pending and will be added in a later update (source files after June 2026). PCB is reproducible via any standard 2-layer FR4 fabrication service; the enclosure is printable on any FDM printer. Validated through field deployment at Novak farm, Kranj, Slovenia (4 sensor nodes, 1 concentrator) under OpenAgri SIP13.</w:t>
+        <w:t>Files provided in the v0.1 repository: schematic PDF, Gerber fabrication files, the full BOM (CSV), and the node enclosure STL (mechanical/SFS_Node_Enclosure_v0.1.stl). The editable schematic/PCB source files (Altium project) and the sensor-mount STL are pending and will be added in a later update (source files after June 2026). PCB is reproducible via any standard 2-layer FR4 fabrication service; the enclosure is printable on any FDM printer. Validated through field deployment at Novak farm, Kranj, Slovenia (4 sensor nodes, 1 concentrator) under OpenAgri SIP13.</w:t>
       </w:r>
     </w:p>
     <w:p>
@@ -1489,7 +1489,7 @@
       </w:pPr>
       <w:r>
         <w:rPr/>
-        <w:t>Citation: Inokron d.o.o. (2026). SFS LoRa Sensor Network Node v0.1. OpenAgri EU project, SIP13. https://github.com/Inokron/OA-HWcomponents.</w:t>
+        <w:t>Citation: Inokron d.o.o. (2026). SFS LoRa Sensor Network Node v0.1. OpenAgri EU project, SIP13. https://github.com/inokron-doo/OA-HWcomponents.</w:t>
       </w:r>
     </w:p>
     <w:p>

</xml_diff>

<commit_message>
correct lora frequency to 868 mhz in bom and docs
</commit_message>
<xml_diff>
--- a/docs/SFS_Node_Hardware_Documentation_v0.1.docx
+++ b/docs/SFS_Node_Hardware_Documentation_v0.1.docx
@@ -931,7 +931,7 @@
       </w:r>
       <w:r>
         <w:rPr/>
-        <w:t xml:space="preserve"> LoRa 433 MHz operation subject to EU regulations.</w:t>
+        <w:t xml:space="preserve"> LoRa 868 MHz operation subject to EU regulations.</w:t>
       </w:r>
     </w:p>
     <w:p>
@@ -990,23 +990,7 @@
           <w:bCs w:val="false"/>
           <w:shd w:fill="auto" w:val="clear"/>
         </w:rPr>
-        <w:t xml:space="preserve">Altium Designer (editable source files planned for release </w:t>
-      </w:r>
-      <w:r>
-        <w:rPr>
-          <w:b w:val="false"/>
-          <w:bCs w:val="false"/>
-          <w:shd w:fill="auto" w:val="clear"/>
-        </w:rPr>
-        <w:t>at the end of</w:t>
-      </w:r>
-      <w:r>
-        <w:rPr>
-          <w:b w:val="false"/>
-          <w:bCs w:val="false"/>
-          <w:shd w:fill="auto" w:val="clear"/>
-        </w:rPr>
-        <w:t xml:space="preserve"> June 2026)</w:t>
+        <w:t>Altium Designer (editable source files planned for release at the end of June 2026)</w:t>
       </w:r>
       <w:r>
         <w:rPr/>
@@ -1131,7 +1115,7 @@
       </w:pPr>
       <w:r>
         <w:rPr/>
-        <w:t>LR02 LoRa module (433 MHz) – 1 pc;</w:t>
+        <w:t>LR02 LoRa module (868 MHz) – 1 pc;</w:t>
       </w:r>
     </w:p>
     <w:p>
@@ -1200,11 +1184,7 @@
       </w:pPr>
       <w:r>
         <w:rPr/>
-        <w:t xml:space="preserve">    • </w:t>
-      </w:r>
-      <w:r>
-        <w:rPr/>
-        <w:t>Sensor node firmware</w:t>
+        <w:t xml:space="preserve">    • Sensor node firmware</w:t>
       </w:r>
     </w:p>
     <w:p>
@@ -1214,11 +1194,7 @@
       </w:pPr>
       <w:r>
         <w:rPr/>
-        <w:t xml:space="preserve">    • </w:t>
-      </w:r>
-      <w:r>
-        <w:rPr/>
-        <w:t>Concentrator node firmware</w:t>
+        <w:t xml:space="preserve">    • Concentrator node firmware</w:t>
       </w:r>
     </w:p>
     <w:p>
@@ -1375,7 +1351,7 @@
       </w:pPr>
       <w:r>
         <w:rPr/>
-        <w:t>PCB operates at 5V DC / 3.3V logic; mains voltage (100–240V AC) is handled by the self-contained HLK-5M05 module mounted separately in the enclosure. Components sourced from Farnell are RoHS-compliant; AliExpress-sourced components are unverified. LoRa 433 MHz operation is subject to local laws. CE marking not assessed.</w:t>
+        <w:t>PCB operates at 5V DC / 3.3V logic; mains voltage (100–240V AC) is handled by the self-contained HLK-5M05 module mounted separately in the enclosure. Components sourced from Farnell are RoHS-compliant; AliExpress-sourced components are unverified. LoRa 868 MHz operation is subject to local laws. CE marking not assessed.</w:t>
       </w:r>
     </w:p>
     <w:p>

</xml_diff>